<commit_message>
Clarify NemoClaw learner setup and investigation checks
Signed-off-by: Clement Pakkam Isaac <cpakkamisaac@nvidia.com>
</commit_message>
<xml_diff>
--- a/agentic/nemoclaw/build-ai-agent/docs/learner-guide.docx
+++ b/agentic/nemoclaw/build-ai-agent/docs/learner-guide.docx
@@ -20,7 +20,7 @@
     </w:p>
     <w:p>
       <w:r>
-        <w:t>Microsoft Ignite 2026  |  Updated 16 October 2026</w:t>
+        <w:t>Microsoft Ignite 2026  |  Instructions revision 27 October 2026</w:t>
       </w:r>
     </w:p>
     <w:p>
@@ -423,325 +423,9 @@
         <w:keepNext/>
       </w:pPr>
       <w:r>
-        <w:t>Use your assigned Skillable lab and Resources tab. The platform prepares AKS and the model.</w:t>
+        <w:t>Use your assigned Skillable lab. The platform prepares AKS and the model. The connection page below identifies each required credential.</w:t>
       </w:r>
     </w:p>
-    <w:tbl>
-      <w:tblPr>
-        <w:tblW w:type="auto" w:w="0"/>
-        <w:jc w:val="center"/>
-        <w:tblLayout w:type="fixed"/>
-        <w:tblLook w:firstColumn="1" w:firstRow="1" w:lastColumn="0" w:lastRow="0" w:noHBand="0" w:noVBand="1" w:val="04A0"/>
-        <w:tblBorders>
-          <w:top w:val="single" w:sz="4" w:color="D9D9D9"/>
-          <w:left w:val="single" w:sz="4" w:color="D9D9D9"/>
-          <w:bottom w:val="single" w:sz="4" w:color="D9D9D9"/>
-          <w:right w:val="single" w:sz="4" w:color="D9D9D9"/>
-          <w:insideH w:val="single" w:sz="4" w:color="D9D9D9"/>
-          <w:insideV w:val="single" w:sz="4" w:color="D9D9D9"/>
-        </w:tblBorders>
-      </w:tblPr>
-      <w:tblGrid>
-        <w:gridCol w:w="3672"/>
-        <w:gridCol w:w="6408"/>
-      </w:tblGrid>
-      <w:tr>
-        <w:trPr>
-          <w:tblHeader w:val="true"/>
-          <w:cantSplit/>
-        </w:trPr>
-        <w:tc>
-          <w:tcPr>
-            <w:tcW w:type="dxa" w:w="3672"/>
-            <w:vAlign w:val="center"/>
-            <w:tcMar>
-              <w:top w:w="90" w:type="dxa"/>
-              <w:bottom w:w="90" w:type="dxa"/>
-              <w:left w:w="110" w:type="dxa"/>
-              <w:right w:w="110" w:type="dxa"/>
-            </w:tcMar>
-            <w:shd w:fill="F6F8FA"/>
-          </w:tcPr>
-          <w:p>
-            <w:pPr>
-              <w:keepNext/>
-              <w:spacing w:after="20" w:line="257" w:lineRule="auto"/>
-            </w:pPr>
-            <w:r>
-              <w:rPr>
-                <w:rFonts w:ascii="Arial" w:hAnsi="Arial"/>
-                <w:b/>
-                <w:color w:val="000000"/>
-                <w:sz w:val="20"/>
-              </w:rPr>
-              <w:t>Item</w:t>
-            </w:r>
-          </w:p>
-        </w:tc>
-        <w:tc>
-          <w:tcPr>
-            <w:tcW w:type="dxa" w:w="6408"/>
-            <w:vAlign w:val="center"/>
-            <w:tcMar>
-              <w:top w:w="90" w:type="dxa"/>
-              <w:bottom w:w="90" w:type="dxa"/>
-              <w:left w:w="110" w:type="dxa"/>
-              <w:right w:w="110" w:type="dxa"/>
-            </w:tcMar>
-            <w:shd w:fill="F6F8FA"/>
-          </w:tcPr>
-          <w:p>
-            <w:pPr>
-              <w:keepNext/>
-              <w:spacing w:after="20" w:line="257" w:lineRule="auto"/>
-            </w:pPr>
-            <w:r>
-              <w:rPr>
-                <w:rFonts w:ascii="Arial" w:hAnsi="Arial"/>
-                <w:b/>
-                <w:color w:val="000000"/>
-                <w:sz w:val="20"/>
-              </w:rPr>
-              <w:t>Where to find it</w:t>
-            </w:r>
-          </w:p>
-        </w:tc>
-      </w:tr>
-      <w:tr>
-        <w:trPr>
-          <w:cantSplit/>
-        </w:trPr>
-        <w:tc>
-          <w:tcPr>
-            <w:tcW w:type="dxa" w:w="3672"/>
-            <w:vAlign w:val="center"/>
-            <w:tcMar>
-              <w:top w:w="90" w:type="dxa"/>
-              <w:bottom w:w="90" w:type="dxa"/>
-              <w:left w:w="110" w:type="dxa"/>
-              <w:right w:w="110" w:type="dxa"/>
-            </w:tcMar>
-          </w:tcPr>
-          <w:p>
-            <w:pPr>
-              <w:keepNext/>
-              <w:spacing w:after="20" w:line="257" w:lineRule="auto"/>
-            </w:pPr>
-            <w:r>
-              <w:rPr>
-                <w:rFonts w:ascii="Arial" w:hAnsi="Arial"/>
-                <w:b w:val="0"/>
-                <w:color w:val="000000"/>
-                <w:sz w:val="20"/>
-              </w:rPr>
-              <w:t>Windows client credentials</w:t>
-            </w:r>
-          </w:p>
-        </w:tc>
-        <w:tc>
-          <w:tcPr>
-            <w:tcW w:type="dxa" w:w="6408"/>
-            <w:vAlign w:val="center"/>
-            <w:tcMar>
-              <w:top w:w="90" w:type="dxa"/>
-              <w:bottom w:w="90" w:type="dxa"/>
-              <w:left w:w="110" w:type="dxa"/>
-              <w:right w:w="110" w:type="dxa"/>
-            </w:tcMar>
-          </w:tcPr>
-          <w:p>
-            <w:pPr>
-              <w:keepNext/>
-              <w:spacing w:after="20" w:line="257" w:lineRule="auto"/>
-            </w:pPr>
-            <w:r>
-              <w:rPr>
-                <w:rFonts w:ascii="Arial" w:hAnsi="Arial"/>
-                <w:b w:val="0"/>
-                <w:color w:val="000000"/>
-                <w:sz w:val="20"/>
-              </w:rPr>
-              <w:t>Resources entry for Win11-CL-01, if a desktop sign-in is required</w:t>
-            </w:r>
-          </w:p>
-        </w:tc>
-      </w:tr>
-      <w:tr>
-        <w:trPr>
-          <w:cantSplit/>
-        </w:trPr>
-        <w:tc>
-          <w:tcPr>
-            <w:tcW w:type="dxa" w:w="3672"/>
-            <w:vAlign w:val="center"/>
-            <w:tcMar>
-              <w:top w:w="90" w:type="dxa"/>
-              <w:bottom w:w="90" w:type="dxa"/>
-              <w:left w:w="110" w:type="dxa"/>
-              <w:right w:w="110" w:type="dxa"/>
-            </w:tcMar>
-          </w:tcPr>
-          <w:p>
-            <w:pPr>
-              <w:keepNext/>
-              <w:spacing w:after="20" w:line="257" w:lineRule="auto"/>
-            </w:pPr>
-            <w:r>
-              <w:rPr>
-                <w:rFonts w:ascii="Arial" w:hAnsi="Arial"/>
-                <w:b w:val="0"/>
-                <w:color w:val="000000"/>
-                <w:sz w:val="20"/>
-              </w:rPr>
-              <w:t>Azure username and password or TAP</w:t>
-            </w:r>
-          </w:p>
-        </w:tc>
-        <w:tc>
-          <w:tcPr>
-            <w:tcW w:type="dxa" w:w="6408"/>
-            <w:vAlign w:val="center"/>
-            <w:tcMar>
-              <w:top w:w="90" w:type="dxa"/>
-              <w:bottom w:w="90" w:type="dxa"/>
-              <w:left w:w="110" w:type="dxa"/>
-              <w:right w:w="110" w:type="dxa"/>
-            </w:tcMar>
-          </w:tcPr>
-          <w:p>
-            <w:pPr>
-              <w:keepNext/>
-              <w:spacing w:after="20" w:line="257" w:lineRule="auto"/>
-            </w:pPr>
-            <w:r>
-              <w:rPr>
-                <w:rFonts w:ascii="Arial" w:hAnsi="Arial"/>
-                <w:b w:val="0"/>
-                <w:color w:val="000000"/>
-                <w:sz w:val="20"/>
-              </w:rPr>
-              <w:t>Assigned cloud credentials in Resources</w:t>
-            </w:r>
-          </w:p>
-        </w:tc>
-      </w:tr>
-      <w:tr>
-        <w:trPr>
-          <w:cantSplit/>
-        </w:trPr>
-        <w:tc>
-          <w:tcPr>
-            <w:tcW w:type="dxa" w:w="3672"/>
-            <w:vAlign w:val="center"/>
-            <w:tcMar>
-              <w:top w:w="90" w:type="dxa"/>
-              <w:bottom w:w="90" w:type="dxa"/>
-              <w:left w:w="110" w:type="dxa"/>
-              <w:right w:w="110" w:type="dxa"/>
-            </w:tcMar>
-          </w:tcPr>
-          <w:p>
-            <w:pPr>
-              <w:keepNext/>
-              <w:spacing w:after="20" w:line="257" w:lineRule="auto"/>
-            </w:pPr>
-            <w:r>
-              <w:rPr>
-                <w:rFonts w:ascii="Arial" w:hAnsi="Arial"/>
-                <w:b w:val="0"/>
-                <w:color w:val="000000"/>
-                <w:sz w:val="20"/>
-              </w:rPr>
-              <w:t>Ubuntu username and password</w:t>
-            </w:r>
-          </w:p>
-        </w:tc>
-        <w:tc>
-          <w:tcPr>
-            <w:tcW w:type="dxa" w:w="6408"/>
-            <w:vAlign w:val="center"/>
-            <w:tcMar>
-              <w:top w:w="90" w:type="dxa"/>
-              <w:bottom w:w="90" w:type="dxa"/>
-              <w:left w:w="110" w:type="dxa"/>
-              <w:right w:w="110" w:type="dxa"/>
-            </w:tcMar>
-          </w:tcPr>
-          <w:p>
-            <w:pPr>
-              <w:keepNext/>
-              <w:spacing w:after="20" w:line="257" w:lineRule="auto"/>
-            </w:pPr>
-            <w:r>
-              <w:rPr>
-                <w:rFonts w:ascii="Arial" w:hAnsi="Arial"/>
-                <w:b w:val="0"/>
-                <w:color w:val="000000"/>
-                <w:sz w:val="20"/>
-              </w:rPr>
-              <w:t>Resources entry for NemoClaw_AKS_Ignite; default username labuser</w:t>
-            </w:r>
-          </w:p>
-        </w:tc>
-      </w:tr>
-      <w:tr>
-        <w:trPr>
-          <w:cantSplit/>
-        </w:trPr>
-        <w:tc>
-          <w:tcPr>
-            <w:tcW w:type="dxa" w:w="3672"/>
-            <w:vAlign w:val="center"/>
-            <w:tcMar>
-              <w:top w:w="90" w:type="dxa"/>
-              <w:bottom w:w="90" w:type="dxa"/>
-              <w:left w:w="110" w:type="dxa"/>
-              <w:right w:w="110" w:type="dxa"/>
-            </w:tcMar>
-          </w:tcPr>
-          <w:p>
-            <w:pPr>
-              <w:spacing w:after="20" w:line="257" w:lineRule="auto"/>
-            </w:pPr>
-            <w:r>
-              <w:rPr>
-                <w:rFonts w:ascii="Arial" w:hAnsi="Arial"/>
-                <w:b w:val="0"/>
-                <w:color w:val="000000"/>
-                <w:sz w:val="20"/>
-              </w:rPr>
-              <w:t>Ubuntu public IP address</w:t>
-            </w:r>
-          </w:p>
-        </w:tc>
-        <w:tc>
-          <w:tcPr>
-            <w:tcW w:type="dxa" w:w="6408"/>
-            <w:vAlign w:val="center"/>
-            <w:tcMar>
-              <w:top w:w="90" w:type="dxa"/>
-              <w:bottom w:w="90" w:type="dxa"/>
-              <w:left w:w="110" w:type="dxa"/>
-              <w:right w:w="110" w:type="dxa"/>
-            </w:tcMar>
-          </w:tcPr>
-          <w:p>
-            <w:pPr>
-              <w:spacing w:after="20" w:line="257" w:lineRule="auto"/>
-            </w:pPr>
-            <w:r>
-              <w:rPr>
-                <w:rFonts w:ascii="Arial" w:hAnsi="Arial"/>
-                <w:b w:val="0"/>
-                <w:color w:val="000000"/>
-                <w:sz w:val="20"/>
-              </w:rPr>
-              <w:t>Assigned Azure VM Overview page</w:t>
-            </w:r>
-          </w:p>
-        </w:tc>
-      </w:tr>
-    </w:tbl>
     <w:p>
       <w:pPr>
         <w:spacing w:after="20"/>
@@ -1146,6 +830,313 @@
         <w:t>Connect to Ubuntu</w:t>
       </w:r>
     </w:p>
+    <w:tbl>
+      <w:tblPr>
+        <w:tblW w:type="auto" w:w="0"/>
+        <w:jc w:val="center"/>
+        <w:tblLayout w:type="fixed"/>
+        <w:tblLook w:firstColumn="1" w:firstRow="1" w:lastColumn="0" w:lastRow="0" w:noHBand="0" w:noVBand="1" w:val="04A0"/>
+        <w:tblBorders>
+          <w:top w:val="single" w:sz="4" w:color="D9D9D9"/>
+          <w:left w:val="single" w:sz="4" w:color="D9D9D9"/>
+          <w:bottom w:val="single" w:sz="4" w:color="D9D9D9"/>
+          <w:right w:val="single" w:sz="4" w:color="D9D9D9"/>
+          <w:insideH w:val="single" w:sz="4" w:color="D9D9D9"/>
+          <w:insideV w:val="single" w:sz="4" w:color="D9D9D9"/>
+        </w:tblBorders>
+      </w:tblPr>
+      <w:tblGrid>
+        <w:gridCol w:w="3672"/>
+        <w:gridCol w:w="6408"/>
+      </w:tblGrid>
+      <w:tr>
+        <w:trPr>
+          <w:tblHeader w:val="true"/>
+          <w:cantSplit/>
+        </w:trPr>
+        <w:tc>
+          <w:tcPr>
+            <w:tcW w:type="dxa" w:w="3672"/>
+            <w:vAlign w:val="center"/>
+            <w:tcMar>
+              <w:top w:w="90" w:type="dxa"/>
+              <w:bottom w:w="90" w:type="dxa"/>
+              <w:left w:w="110" w:type="dxa"/>
+              <w:right w:w="110" w:type="dxa"/>
+            </w:tcMar>
+            <w:shd w:fill="F6F8FA"/>
+          </w:tcPr>
+          <w:p>
+            <w:pPr>
+              <w:keepNext/>
+              <w:spacing w:after="20" w:line="257" w:lineRule="auto"/>
+            </w:pPr>
+            <w:r>
+              <w:rPr>
+                <w:rFonts w:ascii="Arial" w:hAnsi="Arial"/>
+                <w:b/>
+                <w:color w:val="000000"/>
+                <w:sz w:val="20"/>
+              </w:rPr>
+              <w:t>Item</w:t>
+            </w:r>
+          </w:p>
+        </w:tc>
+        <w:tc>
+          <w:tcPr>
+            <w:tcW w:type="dxa" w:w="6408"/>
+            <w:vAlign w:val="center"/>
+            <w:tcMar>
+              <w:top w:w="90" w:type="dxa"/>
+              <w:bottom w:w="90" w:type="dxa"/>
+              <w:left w:w="110" w:type="dxa"/>
+              <w:right w:w="110" w:type="dxa"/>
+            </w:tcMar>
+            <w:shd w:fill="F6F8FA"/>
+          </w:tcPr>
+          <w:p>
+            <w:pPr>
+              <w:keepNext/>
+              <w:spacing w:after="20" w:line="257" w:lineRule="auto"/>
+            </w:pPr>
+            <w:r>
+              <w:rPr>
+                <w:rFonts w:ascii="Arial" w:hAnsi="Arial"/>
+                <w:b/>
+                <w:color w:val="000000"/>
+                <w:sz w:val="20"/>
+              </w:rPr>
+              <w:t>Where to find it</w:t>
+            </w:r>
+          </w:p>
+        </w:tc>
+      </w:tr>
+      <w:tr>
+        <w:trPr>
+          <w:cantSplit/>
+        </w:trPr>
+        <w:tc>
+          <w:tcPr>
+            <w:tcW w:type="dxa" w:w="3672"/>
+            <w:vAlign w:val="center"/>
+            <w:tcMar>
+              <w:top w:w="90" w:type="dxa"/>
+              <w:bottom w:w="90" w:type="dxa"/>
+              <w:left w:w="110" w:type="dxa"/>
+              <w:right w:w="110" w:type="dxa"/>
+            </w:tcMar>
+          </w:tcPr>
+          <w:p>
+            <w:pPr>
+              <w:keepNext/>
+              <w:spacing w:after="20" w:line="257" w:lineRule="auto"/>
+            </w:pPr>
+            <w:r>
+              <w:rPr>
+                <w:rFonts w:ascii="Arial" w:hAnsi="Arial"/>
+                <w:b w:val="0"/>
+                <w:color w:val="000000"/>
+                <w:sz w:val="20"/>
+              </w:rPr>
+              <w:t>Windows client credentials</w:t>
+            </w:r>
+          </w:p>
+        </w:tc>
+        <w:tc>
+          <w:tcPr>
+            <w:tcW w:type="dxa" w:w="6408"/>
+            <w:vAlign w:val="center"/>
+            <w:tcMar>
+              <w:top w:w="90" w:type="dxa"/>
+              <w:bottom w:w="90" w:type="dxa"/>
+              <w:left w:w="110" w:type="dxa"/>
+              <w:right w:w="110" w:type="dxa"/>
+            </w:tcMar>
+          </w:tcPr>
+          <w:p>
+            <w:pPr>
+              <w:keepNext/>
+              <w:spacing w:after="20" w:line="257" w:lineRule="auto"/>
+            </w:pPr>
+            <w:r>
+              <w:rPr>
+                <w:rFonts w:ascii="Arial" w:hAnsi="Arial"/>
+                <w:b w:val="0"/>
+                <w:color w:val="000000"/>
+                <w:sz w:val="20"/>
+              </w:rPr>
+              <w:t>Resources entry for Win11-CL-01, if a desktop sign-in is required</w:t>
+            </w:r>
+          </w:p>
+        </w:tc>
+      </w:tr>
+      <w:tr>
+        <w:trPr>
+          <w:cantSplit/>
+        </w:trPr>
+        <w:tc>
+          <w:tcPr>
+            <w:tcW w:type="dxa" w:w="3672"/>
+            <w:vAlign w:val="center"/>
+            <w:tcMar>
+              <w:top w:w="90" w:type="dxa"/>
+              <w:bottom w:w="90" w:type="dxa"/>
+              <w:left w:w="110" w:type="dxa"/>
+              <w:right w:w="110" w:type="dxa"/>
+            </w:tcMar>
+          </w:tcPr>
+          <w:p>
+            <w:pPr>
+              <w:keepNext/>
+              <w:spacing w:after="20" w:line="257" w:lineRule="auto"/>
+            </w:pPr>
+            <w:r>
+              <w:rPr>
+                <w:rFonts w:ascii="Arial" w:hAnsi="Arial"/>
+                <w:b w:val="0"/>
+                <w:color w:val="000000"/>
+                <w:sz w:val="20"/>
+              </w:rPr>
+              <w:t>Azure username and password or TAP</w:t>
+            </w:r>
+          </w:p>
+        </w:tc>
+        <w:tc>
+          <w:tcPr>
+            <w:tcW w:type="dxa" w:w="6408"/>
+            <w:vAlign w:val="center"/>
+            <w:tcMar>
+              <w:top w:w="90" w:type="dxa"/>
+              <w:bottom w:w="90" w:type="dxa"/>
+              <w:left w:w="110" w:type="dxa"/>
+              <w:right w:w="110" w:type="dxa"/>
+            </w:tcMar>
+          </w:tcPr>
+          <w:p>
+            <w:pPr>
+              <w:keepNext/>
+              <w:spacing w:after="20" w:line="257" w:lineRule="auto"/>
+            </w:pPr>
+            <w:r>
+              <w:rPr>
+                <w:rFonts w:ascii="Arial" w:hAnsi="Arial"/>
+                <w:b w:val="0"/>
+                <w:color w:val="000000"/>
+                <w:sz w:val="20"/>
+              </w:rPr>
+              <w:t>Assigned cloud credentials in Resources</w:t>
+            </w:r>
+          </w:p>
+        </w:tc>
+      </w:tr>
+      <w:tr>
+        <w:trPr>
+          <w:cantSplit/>
+        </w:trPr>
+        <w:tc>
+          <w:tcPr>
+            <w:tcW w:type="dxa" w:w="3672"/>
+            <w:vAlign w:val="center"/>
+            <w:tcMar>
+              <w:top w:w="90" w:type="dxa"/>
+              <w:bottom w:w="90" w:type="dxa"/>
+              <w:left w:w="110" w:type="dxa"/>
+              <w:right w:w="110" w:type="dxa"/>
+            </w:tcMar>
+          </w:tcPr>
+          <w:p>
+            <w:pPr>
+              <w:keepNext/>
+              <w:spacing w:after="20" w:line="257" w:lineRule="auto"/>
+            </w:pPr>
+            <w:r>
+              <w:rPr>
+                <w:rFonts w:ascii="Arial" w:hAnsi="Arial"/>
+                <w:b w:val="0"/>
+                <w:color w:val="000000"/>
+                <w:sz w:val="20"/>
+              </w:rPr>
+              <w:t>Ubuntu username and password</w:t>
+            </w:r>
+          </w:p>
+        </w:tc>
+        <w:tc>
+          <w:tcPr>
+            <w:tcW w:type="dxa" w:w="6408"/>
+            <w:vAlign w:val="center"/>
+            <w:tcMar>
+              <w:top w:w="90" w:type="dxa"/>
+              <w:bottom w:w="90" w:type="dxa"/>
+              <w:left w:w="110" w:type="dxa"/>
+              <w:right w:w="110" w:type="dxa"/>
+            </w:tcMar>
+          </w:tcPr>
+          <w:p>
+            <w:pPr>
+              <w:keepNext/>
+              <w:spacing w:after="20" w:line="257" w:lineRule="auto"/>
+            </w:pPr>
+            <w:r>
+              <w:rPr>
+                <w:rFonts w:ascii="Arial" w:hAnsi="Arial"/>
+                <w:b w:val="0"/>
+                <w:color w:val="000000"/>
+                <w:sz w:val="20"/>
+              </w:rPr>
+              <w:t>Resources entry for NemoClaw_AKS_Ignite; default username labuser</w:t>
+            </w:r>
+          </w:p>
+        </w:tc>
+      </w:tr>
+      <w:tr>
+        <w:trPr>
+          <w:cantSplit/>
+        </w:trPr>
+        <w:tc>
+          <w:tcPr>
+            <w:tcW w:type="dxa" w:w="3672"/>
+            <w:vAlign w:val="center"/>
+            <w:tcMar>
+              <w:top w:w="90" w:type="dxa"/>
+              <w:bottom w:w="90" w:type="dxa"/>
+              <w:left w:w="110" w:type="dxa"/>
+              <w:right w:w="110" w:type="dxa"/>
+            </w:tcMar>
+          </w:tcPr>
+          <w:p>
+            <w:pPr>
+              <w:spacing w:after="20" w:line="257" w:lineRule="auto"/>
+            </w:pPr>
+            <w:r>
+              <w:rPr>
+                <w:rFonts w:ascii="Arial" w:hAnsi="Arial"/>
+                <w:b w:val="0"/>
+                <w:color w:val="000000"/>
+                <w:sz w:val="20"/>
+              </w:rPr>
+              <w:t>Ubuntu public IP address</w:t>
+            </w:r>
+          </w:p>
+        </w:tc>
+        <w:tc>
+          <w:tcPr>
+            <w:tcW w:type="dxa" w:w="6408"/>
+            <w:vAlign w:val="center"/>
+            <w:tcMar>
+              <w:top w:w="90" w:type="dxa"/>
+              <w:bottom w:w="90" w:type="dxa"/>
+              <w:left w:w="110" w:type="dxa"/>
+              <w:right w:w="110" w:type="dxa"/>
+            </w:tcMar>
+          </w:tcPr>
+          <w:p>
+            <w:r>
+              <w:t>VM Overview: public IP associated with the network interface (NIC)</w:t>
+            </w:r>
+          </w:p>
+        </w:tc>
+      </w:tr>
+    </w:tbl>
     <w:p>
       <w:pPr>
         <w:numPr>
@@ -1154,7 +1145,7 @@
         </w:numPr>
       </w:pPr>
       <w:r>
-        <w:t>If required, sign in to the Windows client using Resources credentials.</w:t>
+        <w:t>If required, sign in to the Windows client using the Windows credentials in Resources.</w:t>
       </w:r>
     </w:p>
     <w:p>
@@ -1165,7 +1156,7 @@
         </w:numPr>
       </w:pPr>
       <w:r>
-        <w:t>Sign in at https://portal.azure.com with the assigned Azure credentials or Temporary Access Pass.</w:t>
+        <w:t>Sign in at https://portal.azure.com with the assigned Azure username and password or Temporary Access Pass (TAP) from Resources.</w:t>
       </w:r>
     </w:p>
     <w:p>
@@ -1176,7 +1167,7 @@
         </w:numPr>
       </w:pPr>
       <w:r>
-        <w:t>Open the assigned resource group and Ubuntu VM whose name starts with ignite-agent- and ends with -vm.</w:t>
+        <w:t>In the portal, open Virtual machines. Filter to the subscription shown in Resources and select your assigned VM: its name starts with ignite-agent- and ends with -vm. Its Overview page shows the actual resource group name.</w:t>
       </w:r>
     </w:p>
     <w:p>
@@ -1187,7 +1178,7 @@
         </w:numPr>
       </w:pPr>
       <w:r>
-        <w:t>Copy its Public IP address from Overview.</w:t>
+        <w:t>On that VM, copy the Public IP address associated with its network interface (NIC). If two addresses appear, use the NIC address. The NAT gateway public IP is for outbound traffic and is not the SSH address.</w:t>
       </w:r>
     </w:p>
     <w:p>
@@ -1241,7 +1232,7 @@
     </w:p>
     <w:p>
       <w:r>
-        <w:t>Use the Ubuntu username from Resources if it differs from labuser. Confirm the first-connection fingerprint with the lab assistant. Enter the VM password; typing stays hidden.</w:t>
+        <w:t>For SSH, use the Ubuntu username and VM password under NemoClaw_AKS_Ignite in Resources. The usual username is labuser. Confirm the first-connection fingerprint with the lab assistant. Password typing stays hidden.</w:t>
       </w:r>
     </w:p>
     <w:p>
@@ -1298,6 +1289,18 @@
       </w:r>
     </w:p>
     <w:p>
+      <w:pPr/>
+      <w:r>
+        <w:rPr>
+          <w:b/>
+        </w:rPr>
+        <w:t xml:space="preserve">Note: </w:t>
+      </w:r>
+      <w:r>
+        <w:t>Instructor recovery instance only. If your instructor assigned a preinstalled instance and the report says status ready with agent ready, load Task 1 settings, skip the installer and attachment, and continue at Check the sandbox and tool catalog.</w:t>
+      </w:r>
+    </w:p>
+    <w:p>
       <w:pPr>
         <w:pStyle w:val="Heading1"/>
       </w:pPr>
@@ -1318,7 +1321,7 @@
         <w:keepNext/>
       </w:pPr>
       <w:r>
-        <w:t>Run as the assigned Ubuntu user, without sudo:</w:t>
+        <w:t>Run on Ubuntu as labuser, or the assigned Ubuntu username:</w:t>
       </w:r>
     </w:p>
     <w:p>
@@ -1392,7 +1395,7 @@
     </w:p>
     <w:p>
       <w:r>
-        <w:t>Both version checks should succeed. Do not share environment.sh; it contains lab credentials.</w:t>
+        <w:t>Expected: Node v24.21.0; Docker prints a server version (29.9.1 in the tested run). Stop if either check fails. Do not share environment.sh; it contains lab credentials.</w:t>
       </w:r>
     </w:p>
     <w:p>
@@ -1522,7 +1525,7 @@
     </w:p>
     <w:p>
       <w:r>
-        <w:t>Require checksum OK. This command accepts the third-party software notice, installs NemoClaw v0.0.132, and creates ignite-agent. Wait for onboarding to finish; ask for help if it fails.</w:t>
+        <w:t>Require checksum OK. This accepts the third-party software notice and creates ignite-agent. Plan for 5-10 minutes; the successful rehearsal took 4 minutes 37 seconds. Downloads vary. Wait for installation complete and the Ubuntu prompt before continuing.</w:t>
       </w:r>
     </w:p>
     <w:p>
@@ -1687,7 +1690,7 @@
     </w:p>
     <w:p>
       <w:r>
-        <w:t>Expected: NemoClaw v0.0.132; sandbox running; aks-ops attached; managed credential ready. Discovery should list 11 tools with diagnostics []. Names may start with aks-ops__. A listed tool can still be denied; later calls verify enforcement.</w:t>
+        <w:t>Expected: NemoClaw v0.0.132, sandbox running, and MCP attached with credential ready. Only the final command, openclaw mcp probe, lists the 11 tool names. Find verify_application, get_desired_config, and get_runtime_config. Names may have an aks-ops__ prefix. Listed tools can still be denied.</w:t>
       </w:r>
     </w:p>
     <w:p>
@@ -1711,22 +1714,15 @@
       </w:pPr>
       <w:r>
         <w:rPr>
-          <w:color w:val="953800"/>
-          <w:noProof/>
+          <w:color w:val="24292F"/>
         </w:rPr>
-        <w:t>IGNITE_MESSAGE</w:t>
-      </w:r>
-      <w:r>
-        <w:rPr>
-          <w:color w:val="24292F"/>
-          <w:noProof/>
-        </w:rPr>
-        <w:t>=</w:t>
+        <w:t>set -o pipefail</w:t>
+        <w:br/>
+        <w:t>IGNITE_MESSAGE=</w:t>
       </w:r>
       <w:r>
         <w:rPr>
           <w:color w:val="0A3069"/>
-          <w:noProof/>
         </w:rPr>
         <w:t>'What is your role when investigating a production API outage?</w:t>
         <w:br/>
@@ -1735,21 +1731,18 @@
       <w:r>
         <w:rPr>
           <w:color w:val="24292F"/>
-          <w:noProof/>
         </w:rPr>
         <w:br/>
       </w:r>
       <w:r>
         <w:rPr>
           <w:color w:val="0550AE"/>
-          <w:noProof/>
         </w:rPr>
         <w:t>nemoclaw</w:t>
       </w:r>
       <w:r>
         <w:rPr>
           <w:color w:val="24292F"/>
-          <w:noProof/>
         </w:rPr>
         <w:t xml:space="preserve"> sandbox exec ignite-agent --timeout 240 -- \</w:t>
         <w:br/>
@@ -1758,14 +1751,12 @@
       <w:r>
         <w:rPr>
           <w:color w:val="0550AE"/>
-          <w:noProof/>
         </w:rPr>
         <w:t>openclaw</w:t>
       </w:r>
       <w:r>
         <w:rPr>
           <w:color w:val="24292F"/>
-          <w:noProof/>
         </w:rPr>
         <w:t xml:space="preserve"> agent --agent main --session-id ignite-baseline-1 \</w:t>
         <w:br/>
@@ -1774,14 +1765,31 @@
       <w:r>
         <w:rPr>
           <w:color w:val="0A3069"/>
-          <w:noProof/>
         </w:rPr>
         <w:t>"$IGNITE_MESSAGE"</w:t>
       </w:r>
+      <w:r>
+        <w:rPr>
+          <w:color w:val="24292F"/>
+        </w:rPr>
+        <w:t xml:space="preserve"> | </w:t>
+      </w:r>
+      <w:r>
+        <w:rPr>
+          <w:color w:val="0550AE"/>
+        </w:rPr>
+        <w:t>tee</w:t>
+      </w:r>
+      <w:r>
+        <w:rPr>
+          <w:color w:val="24292F"/>
+        </w:rPr>
+        <w:t xml:space="preserve"> ~/ignite-baseline.txt</w:t>
+      </w:r>
     </w:p>
     <w:p>
       <w:r>
-        <w:t>Save the response for comparison. If the model fails, use Troubleshooting before continuing.</w:t>
+        <w:t>The reply is displayed and saved as ignite-baseline.txt on Ubuntu. Task 2 uses this same terminal, briefly enters the sandbox, then returns to Ubuntu. If the model fails, stop and use Troubleshooting.</w:t>
       </w:r>
     </w:p>
     <w:p>
@@ -1831,7 +1839,7 @@
         <w:keepNext/>
       </w:pPr>
       <w:r>
-        <w:t>Inside the sandbox, choose your priority and reporting style:</w:t>
+        <w:t>Inside the sandbox, choose a priority. For your first run, keep the supplied three-bullet reporting rule so the comparison has a clear target:</w:t>
       </w:r>
     </w:p>
     <w:p>
@@ -1853,12 +1861,12 @@
         </w:numPr>
       </w:pPr>
       <w:r>
-        <w:t>Reporting: choose three bullets or a short technical handoff. Name the evidence to include.</w:t>
+        <w:t>Reporting: use the supplied Health, Evidence, and Action bullets. Try a different style after completing the comparison.</w:t>
       </w:r>
     </w:p>
     <w:p>
       <w:r>
-        <w:t>Edit priority and reporting in the command below, then run it. Node.js saves the two fields and a backup; no sandbox editor is required.</w:t>
+        <w:t>Edit priority in the command below and keep reporting unchanged for your first comparison, then run it. Node.js saves the two fields and a backup; no sandbox editor is required.</w:t>
       </w:r>
     </w:p>
     <w:p>
@@ -2332,7 +2340,7 @@
         <w:keepNext/>
       </w:pPr>
       <w:r>
-        <w:t>Ask the same question with a fresh session:</w:t>
+        <w:t>Back at the Ubuntu prompt, ask the same question with a fresh session and save the new reply:</w:t>
       </w:r>
     </w:p>
     <w:p>
@@ -2348,22 +2356,15 @@
       </w:pPr>
       <w:r>
         <w:rPr>
-          <w:color w:val="953800"/>
-          <w:noProof/>
+          <w:color w:val="24292F"/>
         </w:rPr>
-        <w:t>IGNITE_MESSAGE</w:t>
-      </w:r>
-      <w:r>
-        <w:rPr>
-          <w:color w:val="24292F"/>
-          <w:noProof/>
-        </w:rPr>
-        <w:t>=</w:t>
+        <w:t>set -o pipefail</w:t>
+        <w:br/>
+        <w:t>IGNITE_MESSAGE=</w:t>
       </w:r>
       <w:r>
         <w:rPr>
           <w:color w:val="0A3069"/>
-          <w:noProof/>
         </w:rPr>
         <w:t>'What is your role when investigating a production API outage?</w:t>
         <w:br/>
@@ -2372,21 +2373,18 @@
       <w:r>
         <w:rPr>
           <w:color w:val="24292F"/>
-          <w:noProof/>
         </w:rPr>
         <w:br/>
       </w:r>
       <w:r>
         <w:rPr>
           <w:color w:val="0550AE"/>
-          <w:noProof/>
         </w:rPr>
         <w:t>nemoclaw</w:t>
       </w:r>
       <w:r>
         <w:rPr>
           <w:color w:val="24292F"/>
-          <w:noProof/>
         </w:rPr>
         <w:t xml:space="preserve"> sandbox exec ignite-agent --timeout 240 -- \</w:t>
         <w:br/>
@@ -2395,14 +2393,12 @@
       <w:r>
         <w:rPr>
           <w:color w:val="0550AE"/>
-          <w:noProof/>
         </w:rPr>
         <w:t>openclaw</w:t>
       </w:r>
       <w:r>
         <w:rPr>
           <w:color w:val="24292F"/>
-          <w:noProof/>
         </w:rPr>
         <w:t xml:space="preserve"> agent --agent main --session-id ignite-custom-1 \</w:t>
         <w:br/>
@@ -2411,35 +2407,31 @@
       <w:r>
         <w:rPr>
           <w:color w:val="0A3069"/>
-          <w:noProof/>
         </w:rPr>
         <w:t>"$IGNITE_MESSAGE"</w:t>
       </w:r>
+      <w:r>
+        <w:rPr>
+          <w:color w:val="24292F"/>
+        </w:rPr>
+        <w:t xml:space="preserve"> | </w:t>
+      </w:r>
+      <w:r>
+        <w:rPr>
+          <w:color w:val="0550AE"/>
+        </w:rPr>
+        <w:t>tee</w:t>
+      </w:r>
+      <w:r>
+        <w:rPr>
+          <w:color w:val="24292F"/>
+        </w:rPr>
+        <w:t xml:space="preserve"> ~/ignite-custom.txt</w:t>
+      </w:r>
     </w:p>
     <w:p>
       <w:r>
-        <w:t>Record one behavior change. If none appears, clarify your rule and retry once with a new session name, such as ignite-custom-2.</w:t>
-      </w:r>
-    </w:p>
-    <w:p>
-      <w:pPr>
-        <w:pStyle w:val="Heading1"/>
-      </w:pPr>
-      <w:r>
-        <w:t>Task 3 Choose the investigation policy</w:t>
-      </w:r>
-    </w:p>
-    <w:p>
-      <w:r>
-        <w:t>Run one profile on Ubuntu. Both deny restart and scaling; Option B also denies logs.</w:t>
-      </w:r>
-    </w:p>
-    <w:p>
-      <w:pPr>
-        <w:pStyle w:val="Heading2"/>
-      </w:pPr>
-      <w:r>
-        <w:t>Option A Allow logs</w:t>
+        <w:t>The default rule asks for three bullets labelled Health, Evidence, and Action. In the rehearsal, the baseline had eight numbered steps and the new reply had those three bullets; wording and baseline format vary. Show the labels from the saved new reply:</w:t>
       </w:r>
     </w:p>
     <w:p>
@@ -2456,20 +2448,45 @@
       <w:r>
         <w:rPr>
           <w:color w:val="0550AE"/>
-          <w:noProof/>
         </w:rPr>
-        <w:t>nemoclaw</w:t>
+        <w:t>grep</w:t>
       </w:r>
       <w:r>
         <w:rPr>
           <w:color w:val="24292F"/>
-          <w:noProof/>
         </w:rPr>
-        <w:t xml:space="preserve"> sandbox mcp ignite-agent update aks-ops \</w:t>
-        <w:br/>
-        <w:t xml:space="preserve">  --deny-tool restart_deployment \</w:t>
-        <w:br/>
-        <w:t xml:space="preserve">  --deny-tool scale_deployment</w:t>
+        <w:t xml:space="preserve"> -nE </w:t>
+      </w:r>
+      <w:r>
+        <w:rPr>
+          <w:color w:val="0A3069"/>
+        </w:rPr>
+        <w:t>'Health|Evidence|Action'</w:t>
+      </w:r>
+      <w:r>
+        <w:rPr>
+          <w:color w:val="24292F"/>
+        </w:rPr>
+        <w:t xml:space="preserve"> ~/ignite-custom.txt</w:t>
+      </w:r>
+    </w:p>
+    <w:p>
+      <w:pPr/>
+      <w:r>
+        <w:t>Record whether the new reply follows your rule and differs from the baseline saved in ignite-baseline.txt. If both already use that format, or the rule is ignored, clarify your reporting rule and retry once as ignite-custom-2. Do not count matching labels alone as proof of a change.</w:t>
+      </w:r>
+    </w:p>
+    <w:p>
+      <w:pPr>
+        <w:pStyle w:val="Heading1"/>
+      </w:pPr>
+      <w:r>
+        <w:t>Task 3 Choose the investigation policy</w:t>
+      </w:r>
+    </w:p>
+    <w:p>
+      <w:r>
+        <w:t>Run one profile on Ubuntu. Both deny restart and scaling; Option B also denies logs.</w:t>
       </w:r>
     </w:p>
     <w:p>
@@ -2477,7 +2494,7 @@
         <w:pStyle w:val="Heading2"/>
       </w:pPr>
       <w:r>
-        <w:t>Option B Deny logs</w:t>
+        <w:t>Option A Allow logs</w:t>
       </w:r>
     </w:p>
     <w:p>
@@ -2507,17 +2524,15 @@
         <w:br/>
         <w:t xml:space="preserve">  --deny-tool restart_deployment \</w:t>
         <w:br/>
-        <w:t xml:space="preserve">  --deny-tool scale_deployment \</w:t>
-        <w:br/>
-        <w:t xml:space="preserve">  --deny-tool get_logs</w:t>
+        <w:t xml:space="preserve">  --deny-tool scale_deployment</w:t>
       </w:r>
     </w:p>
     <w:p>
       <w:pPr>
-        <w:keepNext/>
+        <w:pStyle w:val="Heading2"/>
       </w:pPr>
       <w:r>
-        <w:t>Check MCP attachment and credential readiness:</w:t>
+        <w:t>Option B Deny logs</w:t>
       </w:r>
     </w:p>
     <w:p>
@@ -2543,12 +2558,52 @@
           <w:color w:val="24292F"/>
           <w:noProof/>
         </w:rPr>
-        <w:t xml:space="preserve"> sandbox mcp ignite-agent status aks-ops --json</w:t>
+        <w:t xml:space="preserve"> sandbox mcp ignite-agent update aks-ops \</w:t>
+        <w:br/>
+        <w:t xml:space="preserve">  --deny-tool restart_deployment \</w:t>
+        <w:br/>
+        <w:t xml:space="preserve">  --deny-tool scale_deployment \</w:t>
+        <w:br/>
+        <w:t xml:space="preserve">  --deny-tool get_logs</w:t>
       </w:r>
     </w:p>
     <w:p>
-      <w:r>
-        <w:t>Record your choice and the update result. Each update replaces the deny list. MCP status confirms connection readiness; later tool calls test the denials. Task 7 permits restart while keeping scaling denied.</w:t>
+      <w:pPr>
+        <w:keepNext/>
+      </w:pPr>
+      <w:r>
+        <w:t>Check MCP connection readiness (this output is not a tool catalog):</w:t>
+      </w:r>
+    </w:p>
+    <w:p>
+      <w:pPr>
+        <w:pStyle w:val="LabCode"/>
+        <w:shd w:val="clear" w:fill="F6F8FA"/>
+        <w:pBdr>
+          <w:top w:val="single" w:sz="1" w:space="8" w:color="F6F8FA"/>
+          <w:left w:val="single" w:sz="1" w:space="8" w:color="F6F8FA"/>
+          <w:bottom w:val="single" w:sz="1" w:space="8" w:color="F6F8FA"/>
+          <w:right w:val="single" w:sz="1" w:space="8" w:color="F6F8FA"/>
+        </w:pBdr>
+      </w:pPr>
+      <w:r>
+        <w:rPr>
+          <w:color w:val="0550AE"/>
+          <w:noProof/>
+        </w:rPr>
+        <w:t>nemoclaw</w:t>
+      </w:r>
+      <w:r>
+        <w:rPr>
+          <w:color w:val="24292F"/>
+          <w:noProof/>
+        </w:rPr>
+        <w:t xml:space="preserve"> sandbox mcp ignite-agent status aks-ops --json</w:t>
+      </w:r>
+    </w:p>
+    <w:p>
+      <w:r>
+        <w:t>Record your choice and the update result. Each update replaces the deny list. MCP status shows the connection, not individual tool names or proof of denial. Task 1 lists the tools; Tasks 6 and 8 test enforcement. Task 7 permits restart only.</w:t>
       </w:r>
     </w:p>
     <w:p>
@@ -2934,7 +2989,7 @@
     </w:p>
     <w:p>
       <w:r>
-        <w:t>Save the tool results and proposed repair. An agent summary alone is not verification; ask the assistant for missing tool evidence.</w:t>
+        <w:t>Require all three tool results and the expected configuration difference above. A reply saying no final summary was produced is incomplete, not a diagnosis. Stop at Task 4, save the session ID and error, and ask the lab assistant to inspect tool history. Do not proceed to restart or approval.</w:t>
       </w:r>
     </w:p>
     <w:p>
@@ -4893,6 +4948,20 @@
     <w:p>
       <w:r>
         <w:t>Stop and share the failed check, lab ID, and nonsecret error with the assistant. Provisioning, template, and Azure permission fixes belong to the coordinator.</w:t>
+      </w:r>
+    </w:p>
+    <w:p>
+      <w:pPr>
+        <w:pStyle w:val="Heading2"/>
+      </w:pPr>
+      <w:r>
+        <w:t>No final investigation summary</w:t>
+      </w:r>
+    </w:p>
+    <w:p>
+      <w:pPr/>
+      <w:r>
+        <w:t>Save the task command, session ID, and nonsecret error. The assistant must inspect the recorded tools to distinguish failed or missing calls from a missing model summary. This message alone does not establish a timeout or policy denial. Do not reinstall or repeat a mutation to obtain a summary.</w:t>
       </w:r>
     </w:p>
     <w:p>
@@ -5549,7 +5618,7 @@
         <w:spacing w:line="259" w:lineRule="auto" w:after="80"/>
       </w:pPr>
       <w:r>
-        <w:t>Save the reviewed infra/main.bicep in Studio; GitHub changes do not update Studio. The bundle includes the runtime fixes and a 300-second wait for private ingress IP 10.42.4.10.</w:t>
+        <w:t>Save the reviewed infra/main.bicep in Studio; GitHub changes do not update Studio. Publish SKILLABLE-INSTRUCTIONS.md separately and confirm revision 27 October 2026 in a fresh learner launch.</w:t>
       </w:r>
     </w:p>
     <w:p>

</xml_diff>